<commit_message>
Correct approved officer names and revise transcript review
</commit_message>
<xml_diff>
--- a/findings/2026-10-26-chief-paul-transcript-review.docx
+++ b/findings/2026-10-26-chief-paul-transcript-review.docx
@@ -22,12 +22,12 @@
     </w:p>
     <w:p>
       <w:r>
-        <w:t>This document brings together the 17 potential issues identified in the transcript review, with surrounding original and final wording for discussion with Daniel Sroka. Some entries concern mechanical cleanup; others require confirmation of wording, speaker identity, or an intentional omission.</w:t>
+        <w:t>This document brings together 15 remaining review items, with surrounding original and final wording for discussion with Daniel Sroka. Some entries concern mechanical cleanup; others require confirmation of wording, speaker identity, or an intentional omission.</w:t>
       </w:r>
     </w:p>
     <w:p>
       <w:r>
-        <w:t>The page 10 leftover comparison block has already been removed from the final PDF on staging. Its earlier wording is preserved here for review. The other entries remain questions, not established transcription errors or approved replacements.</w:t>
+        <w:t>The page 10 leftover comparison block has already been removed from the final PDF on staging. Item 01 compares the original app wording directly with the current final. The approved Jaykob Thacker and Carlos Mootz De Arbeloa name corrections have been made and their former review entries removed. Remaining entries are questions, not established transcription errors or approved replacements.</w:t>
       </w:r>
     </w:p>
     <w:p>
@@ -40,7 +40,7 @@
     </w:p>
     <w:p>
       <w:r>
-        <w:t>Original excerpts reproduce the app export without correcting its words. App line breaks have been normalized for readability; final paragraph breaks are retained where available. Punctuation and wording are retained. Original source line numbers refer to the unchanged TXT export. Final page numbers refer to PDF pages, counting the foreword as page 1. Unless noted, final excerpts are from the version reviewed before the October 26 cleanup; all other wording remains the same afterward.</w:t>
+        <w:t>Original excerpts reproduce the app export without correcting its words. App line breaks have been normalized for readability; final paragraph breaks are retained where available. Punctuation and wording are retained. Original source line numbers refer to the unchanged TXT export. Final page numbers refer to PDF pages, counting the foreword as page 1. Final excerpts reflect the current final after the October 26 cleanup and approved name corrections.</w:t>
       </w:r>
     </w:p>
     <w:p>
@@ -185,7 +185,7 @@
         <w:rPr>
           <w:sz w:val="20"/>
         </w:rPr>
-        <w:t>12  Surname omitted after Carlos   |   PDF 28</w:t>
+        <w:t>12  Unfinished Lunt explanation omitted   |   PDF 28</w:t>
       </w:r>
     </w:p>
     <w:p>
@@ -196,7 +196,7 @@
         <w:rPr>
           <w:sz w:val="20"/>
         </w:rPr>
-        <w:t>13  Jacob and Jaykob Thacker   |   PDF 29</w:t>
+        <w:t>13  Unclear closing fragment omitted   |   PDF 32</w:t>
       </w:r>
     </w:p>
     <w:p>
@@ -207,7 +207,7 @@
         <w:rPr>
           <w:sz w:val="20"/>
         </w:rPr>
-        <w:t>14  Unfinished Lunt explanation omitted   |   PDF 28</w:t>
+        <w:t>14  Incorrect label for policy section 608 4 2   |   PDF 14</w:t>
       </w:r>
     </w:p>
     <w:p>
@@ -218,29 +218,7 @@
         <w:rPr>
           <w:sz w:val="20"/>
         </w:rPr>
-        <w:t>15  Unclear closing fragment omitted   |   PDF 32</w:t>
-      </w:r>
-    </w:p>
-    <w:p>
-      <w:pPr>
-        <w:spacing w:after="60"/>
-      </w:pPr>
-      <w:r>
-        <w:rPr>
-          <w:sz w:val="20"/>
-        </w:rPr>
-        <w:t>16  Incorrect label for policy section 608 4 2   |   PDF 14</w:t>
-      </w:r>
-    </w:p>
-    <w:p>
-      <w:pPr>
-        <w:spacing w:after="60"/>
-      </w:pPr>
-      <w:r>
-        <w:rPr>
-          <w:sz w:val="20"/>
-        </w:rPr>
-        <w:t>17  Explanation of reconstruction inside the PDF   |   PDF 1</w:t>
+        <w:t>15  Explanation of reconstruction inside the PDF   |   PDF 1</w:t>
       </w:r>
     </w:p>
     <w:p>
@@ -280,7 +258,7 @@
     </w:p>
     <w:p>
       <w:r>
-        <w:t>Three paragraphs from the U12 original wording comparison block appeared before the consolidated Chief response. The opening false start was unique, while the following wording repeated the edited response.</w:t>
+        <w:t>The original contains an unfinished “Okay, So that that’s not” before the Chief’s response about destroying evidence versus locking a phone. The current final starts directly with “Chief: That is an issue.” The question is whether the opening fragment should be restored after Daniel reviews it.</w:t>
       </w:r>
     </w:p>
     <w:p>
@@ -320,7 +298,7 @@
         <w:pStyle w:val="Sourceexcerpt"/>
       </w:pPr>
       <w:r>
-        <w:t>Okay, So that that's not.</w:t>
+        <w:t>Chief: That is an issue. Again, we'll talk about this when I get findings for you, but destroying evidence is different from a locked phone. If we're destroying evidence, that's very different from someone locking his phone.</w:t>
       </w:r>
     </w:p>
     <w:p>
@@ -328,47 +306,7 @@
         <w:pStyle w:val="Sourceexcerpt"/>
       </w:pPr>
       <w:r>
-        <w:t>That is an issue.</w:t>
-      </w:r>
-    </w:p>
-    <w:p>
-      <w:pPr>
-        <w:pStyle w:val="Sourceexcerpt"/>
-      </w:pPr>
-      <w:r>
-        <w:t>And again, we'll talk about this when I, when I get finalized for you, but destroying evidence is different than a locked phone, right?</w:t>
-      </w:r>
-    </w:p>
-    <w:p>
-      <w:pPr>
-        <w:pStyle w:val="Sourceexcerpt"/>
-      </w:pPr>
-      <w:r>
-        <w:t>Chief: That is an issue. Again, we'll talk about this when I get findings for you, but destroying evidence is different from a locked phone. If we're destroying evidence, that's very different from someone locking his phone.</w:t>
-      </w:r>
-    </w:p>
-    <w:p>
-      <w:pPr>
-        <w:pStyle w:val="Sourceexcerpt"/>
-      </w:pPr>
-      <w:r>
         <w:t>I've heard Lieutenant Adamson's explanation It differs from what's in his report, but what's written in his report would not be a justification for seizing the phone. I completely can see how that's an issue.</w:t>
-      </w:r>
-    </w:p>
-    <w:p>
-      <w:pPr>
-        <w:pStyle w:val="Heading2"/>
-      </w:pPr>
-      <w:r>
-        <w:t>Current final after the October 26 correction</w:t>
-      </w:r>
-    </w:p>
-    <w:p>
-      <w:pPr>
-        <w:pStyle w:val="Sourceexcerpt"/>
-      </w:pPr>
-      <w:r>
-        <w:t>*Interviewer and Chief read through the section out loud* Chief: That is an issue. Again, we'll talk about this when I get findings for you, but destroying evidence is different from a locked phone. If we're destroying evidence, that's very different from someone locking his phone. I've heard Lieutenant Adamson's explanation It differs from what's in his report, but what's written in his report would not be a justification for seizing the phone. I completely can see how that's an issue.</w:t>
       </w:r>
     </w:p>
     <w:p>
@@ -379,7 +317,7 @@
         <w:t xml:space="preserve">Draft history and supporting context </w:t>
       </w:r>
       <w:r>
-        <w:t>V2 identifies the leftover material as ORIGINAL APP WORDING U12. V3 and the final version carried over part of that comparison block.</w:t>
+        <w:t>A leftover original wording comparison block was removed from page 10 on October 26, 2026. The final excerpt shows the current wording after that removal. V2 U12 preserves the original fragment for reference.</w:t>
       </w:r>
     </w:p>
     <w:p>
@@ -390,7 +328,7 @@
         <w:t xml:space="preserve">Question or next step </w:t>
       </w:r>
       <w:r>
-        <w:t>The leftover block has now been removed at Eric’s direction. Leave the consolidated Chief response intact. Daniel can decide whether the opening false start should be restored and who spoke it.</w:t>
+        <w:t>Ask Daniel whether the unfinished opening should be restored and who spoke it. Keep the current consolidated Chief response intact unless a further correction is agreed.</w:t>
       </w:r>
     </w:p>
     <w:p>
@@ -1495,7 +1433,7 @@
         <w:pStyle w:val="Heading1"/>
       </w:pPr>
       <w:r>
-        <w:t>12 Surname omitted after Carlos</w:t>
+        <w:t>12 Unfinished Lunt explanation omitted</w:t>
       </w:r>
     </w:p>
     <w:p>
@@ -1517,12 +1455,12 @@
         <w:t xml:space="preserve">Review status </w:t>
       </w:r>
       <w:r>
-        <w:t>Name restoration should be documented</w:t>
+        <w:t>Omission needs an intentional decision</w:t>
       </w:r>
     </w:p>
     <w:p>
       <w:r>
-        <w:t>The original includes “Carlos moots the arboleu.” V2 kept the surname as uncertain. The final removes it and leaves only Carlos.</w:t>
+        <w:t>The original continues after Spanish Fork with “and so he just didn’t want…” before the next officer’s name. V2 retained an unfinished explanation; the final stops cleanly at Spanish Fork.</w:t>
       </w:r>
     </w:p>
     <w:p>
@@ -1530,7 +1468,7 @@
         <w:pStyle w:val="Heading2"/>
       </w:pPr>
       <w:r>
-        <w:t>Original app text with context   Lines 1870 to 1876</w:t>
+        <w:t>Original app text with context   Lines 1860 to 1868</w:t>
       </w:r>
     </w:p>
     <w:p>
@@ -1538,7 +1476,7 @@
         <w:pStyle w:val="Sourceexcerpt"/>
       </w:pPr>
       <w:r>
-        <w:t>So we let her Carlos moots the arboleu. Yeah, so he actually was recruited by Ice, so he resigned from emergency and works for ice now. Um, Jacob Thacker, Yeah, he he, um, left. It'll work for County, And That's something you just always wanted.</w:t>
+        <w:t>Austin Lund, such a good guy. He's one of my close friends. He's working on a Spanish Fork right now. His family moved to Spanish Fork, and so he just didn't want you Kyrion Merit. Yeah, she didn't actually make it out of FTO, So We have a three-month fto process of field training process, And we had some recurring issues in.</w:t>
       </w:r>
     </w:p>
     <w:p>
@@ -1554,7 +1492,7 @@
         <w:pStyle w:val="Sourceexcerpt"/>
       </w:pPr>
       <w:r>
-        <w:t>Interviewer: Carlos</w:t>
+        <w:t>Interviewer: Austin Lunt.</w:t>
       </w:r>
     </w:p>
     <w:p>
@@ -1562,7 +1500,7 @@
         <w:pStyle w:val="Sourceexcerpt"/>
       </w:pPr>
       <w:r>
-        <w:t>Chief: He was actually recruited by ICE, so he resigned from [our agency] and works for ICE now. Interviewer: Jacob Thacker.</w:t>
+        <w:t>Chief: Such a good guy. He's one of my close friends. He's working in Spanish Fork right now. His family moved to Spanish Fork.</w:t>
       </w:r>
     </w:p>
     <w:p>
@@ -1570,7 +1508,15 @@
         <w:pStyle w:val="Sourceexcerpt"/>
       </w:pPr>
       <w:r>
-        <w:t>Chief: He left to work for the county. That's something he always wanted.</w:t>
+        <w:t>Interviewer: Kirienn Marrott.</w:t>
+      </w:r>
+    </w:p>
+    <w:p>
+      <w:pPr>
+        <w:pStyle w:val="Sourceexcerpt"/>
+      </w:pPr>
+      <w:r>
+        <w:t>Chief: She didn't actually make it out of FTO. We have a three-month FTO process—a field training process—and we had some recurring issues, so we let her go.</w:t>
       </w:r>
     </w:p>
     <w:p>
@@ -1581,7 +1527,7 @@
         <w:t xml:space="preserve">Draft history and supporting context </w:t>
       </w:r>
       <w:r>
-        <w:t>V2 U35 retains “[surname unclear; transcribed as ‘moots the arboleu’].” Roster page 2 lists Mootz De Arbeloa, Carlos T.</w:t>
+        <w:t>V2 U33 and U34 preserve “so he just didn’t want to [unfinished explanation].” V3 omits it; the final later changes the remaining comma to a period.</w:t>
       </w:r>
     </w:p>
     <w:p>
@@ -1592,7 +1538,7 @@
         <w:t xml:space="preserve">Question or next step </w:t>
       </w:r>
       <w:r>
-        <w:t>Review restoring the surname using the roster, with the same editorial transparency used for Lunt and Marrott. The roster identifies Carlos T. Mootz De Arbeloa; it does not independently verify the spoken pronunciation.</w:t>
+        <w:t>Ask Daniel whether there was a meaningful unfinished explanation. If so, retain it with an unfinished thought marker. If it was merely an abandoned start, record the decision to omit it.</w:t>
       </w:r>
     </w:p>
     <w:p>
@@ -1605,7 +1551,7 @@
         <w:pStyle w:val="Heading1"/>
       </w:pPr>
       <w:r>
-        <w:t>13 Jacob and Jaykob Thacker</w:t>
+        <w:t>13 Unclear closing fragment omitted</w:t>
       </w:r>
     </w:p>
     <w:p>
@@ -1616,7 +1562,7 @@
         <w:t xml:space="preserve">Location </w:t>
       </w:r>
       <w:r>
-        <w:t>Final PDF page 29</w:t>
+        <w:t>Final PDF page 32</w:t>
       </w:r>
     </w:p>
     <w:p>
@@ -1627,12 +1573,12 @@
         <w:t xml:space="preserve">Review status </w:t>
       </w:r>
       <w:r>
-        <w:t>Name spelling should be checked</w:t>
+        <w:t>Relevance and omission need confirmation</w:t>
       </w:r>
     </w:p>
     <w:p>
       <w:r>
-        <w:t>The final keeps the app spelling Jacob Thacker, while the department roster spells the officer’s name Jaykob P. Thacker. Other names in this same discussion have already received documented spelling corrections.</w:t>
+        <w:t>After the email discussion, the original contains “The only thing that’s semi edible is probably the present. This letter look at the house.” V2 retained an unclear closing fragment; the final deletes it entirely.</w:t>
       </w:r>
     </w:p>
     <w:p>
@@ -1640,7 +1586,7 @@
         <w:pStyle w:val="Heading2"/>
       </w:pPr>
       <w:r>
-        <w:t>Original app text with context   Lines 1874 to 1878</w:t>
+        <w:t>Original app text with context   Lines 2091 to 2103</w:t>
       </w:r>
     </w:p>
     <w:p>
@@ -1648,7 +1594,7 @@
         <w:pStyle w:val="Sourceexcerpt"/>
       </w:pPr>
       <w:r>
-        <w:t>Um, Jacob Thacker, Yeah, he he, um, left. It'll work for County, And That's something you just always wanted. Sounds like 20, 25, was just a hard year with with.</w:t>
+        <w:t>Okay, I'll send an email with you, and with the mayor. Just saying that we had this meeting, is that okay? Oh yeah, for sure. I, if you want whatever he does on his end, it's but yeah, absolutely. Um, Not totally fine. The only thing that's semi edible is probably the present. This letter look at the house. 6:37 PM</w:t>
       </w:r>
     </w:p>
     <w:p>
@@ -1664,7 +1610,7 @@
         <w:pStyle w:val="Sourceexcerpt"/>
       </w:pPr>
       <w:r>
-        <w:t>Interviewer: Jacob Thacker.</w:t>
+        <w:t>Interviewer: I'll send an email with you and the mayor, just saying we had this meeting. Is that okay?</w:t>
       </w:r>
     </w:p>
     <w:p>
@@ -1672,7 +1618,7 @@
         <w:pStyle w:val="Sourceexcerpt"/>
       </w:pPr>
       <w:r>
-        <w:t>Chief: He left to work for the county. That's something he always wanted.</w:t>
+        <w:t>Chief: For sure. Whatever he does on his end, absolutely. That's totally fine.</w:t>
       </w:r>
     </w:p>
     <w:p>
@@ -1680,7 +1626,15 @@
         <w:pStyle w:val="Sourceexcerpt"/>
       </w:pPr>
       <w:r>
-        <w:t>Interviewer: Sounds like 2025 was just a hard year with—</w:t>
+        <w:t>6:37 PM</w:t>
+      </w:r>
+    </w:p>
+    <w:p>
+      <w:pPr>
+        <w:pStyle w:val="Sourceexcerpt"/>
+      </w:pPr>
+      <w:r>
+        <w:t>END OF SOURCE</w:t>
       </w:r>
     </w:p>
     <w:p>
@@ -1691,7 +1645,7 @@
         <w:t xml:space="preserve">Draft history and supporting context </w:t>
       </w:r>
       <w:r>
-        <w:t>Roster page 2 lists Thacker, Jaykob P., with an August 14, 2025 departure date.</w:t>
+        <w:t>V2 U42 and U43 explicitly preserve the uncertainty. The 6:37 PM timestamp itself is in the original; this review does not establish that it is the interview end time.</w:t>
       </w:r>
     </w:p>
     <w:p>
@@ -1702,7 +1656,7 @@
         <w:t xml:space="preserve">Question or next step </w:t>
       </w:r>
       <w:r>
-        <w:t>Confirm this is the same officer and document a spelling normalization to Jaykob if adopted. Do not imply that roster spelling proves the exact words spoken.</w:t>
+        <w:t>Ask Daniel whether this was unrelated background speech, an app error, or part of the meeting. Do not restore the nonsense literally as intelligible dialogue or silently assume it was irrelevant.</w:t>
       </w:r>
     </w:p>
     <w:p>
@@ -1715,7 +1669,7 @@
         <w:pStyle w:val="Heading1"/>
       </w:pPr>
       <w:r>
-        <w:t>14 Unfinished Lunt explanation omitted</w:t>
+        <w:t>14 Incorrect label for policy section 608 4 2</w:t>
       </w:r>
     </w:p>
     <w:p>
@@ -1726,7 +1680,7 @@
         <w:t xml:space="preserve">Location </w:t>
       </w:r>
       <w:r>
-        <w:t>Final PDF page 28</w:t>
+        <w:t>Final PDF page 14</w:t>
       </w:r>
     </w:p>
     <w:p>
@@ -1737,12 +1691,12 @@
         <w:t xml:space="preserve">Review status </w:t>
       </w:r>
       <w:r>
-        <w:t>Omission needs an intentional decision</w:t>
+        <w:t>Document annotation correction proposed</w:t>
       </w:r>
     </w:p>
     <w:p>
       <w:r>
-        <w:t>The original continues after Spanish Fork with “and so he just didn’t want…” before the next officer’s name. V2 retained an unfinished explanation; the final stops cleanly at Spanish Fork.</w:t>
+        <w:t>The final annotation calls section 608.4.2 Operations Planning and Deconfliction. In the supplied manual, that numbered subsection is titled Risk Assessment Review.</w:t>
       </w:r>
     </w:p>
     <w:p>
@@ -1750,7 +1704,7 @@
         <w:pStyle w:val="Heading2"/>
       </w:pPr>
       <w:r>
-        <w:t>Original app text with context   Lines 1860 to 1868</w:t>
+        <w:t>Original app text with context   Lines 839 to 843</w:t>
       </w:r>
     </w:p>
     <w:p>
@@ -1758,7 +1712,7 @@
         <w:pStyle w:val="Sourceexcerpt"/>
       </w:pPr>
       <w:r>
-        <w:t>Austin Lund, such a good guy. He's one of my close friends. He's working on a Spanish Fork right now. His family moved to Spanish Fork, and so he just didn't want you Kyrion Merit. Yeah, she didn't actually make it out of FTO, So We have a three-month fto process of field training process, And we had some recurring issues in.</w:t>
+        <w:t>So, under this section that I have marked and highlighted, it says that search warrants app search warrants, affidavits, And a restaurant to the chief of police and designee, so that you in this it has that use that. You have a designated for these things, but this search warrant was also supposed to be submitted to you as well. Yes, according to our code to my understanding.</w:t>
       </w:r>
     </w:p>
     <w:p>
@@ -1774,7 +1728,7 @@
         <w:pStyle w:val="Sourceexcerpt"/>
       </w:pPr>
       <w:r>
-        <w:t>Interviewer: Austin Lunt.</w:t>
+        <w:t>Interviewer supplies a print out of policy 608.4.2 Operations Planning and Deconfliction with a highlighted portion stating:</w:t>
       </w:r>
     </w:p>
     <w:p>
@@ -1782,7 +1736,7 @@
         <w:pStyle w:val="Sourceexcerpt"/>
       </w:pPr>
       <w:r>
-        <w:t>Chief: Such a good guy. He's one of my close friends. He's working in Spanish Fork right now. His family moved to Spanish Fork.</w:t>
+        <w:t>“Officers will present the risk assessment form and other relevant documents, such as copies of search warrants, affidavits and arrest warrants, to the Chief of Police and designee.”</w:t>
       </w:r>
     </w:p>
     <w:p>
@@ -1790,15 +1744,7 @@
         <w:pStyle w:val="Sourceexcerpt"/>
       </w:pPr>
       <w:r>
-        <w:t>Interviewer: Kirienn Marrott.</w:t>
-      </w:r>
-    </w:p>
-    <w:p>
-      <w:pPr>
-        <w:pStyle w:val="Sourceexcerpt"/>
-      </w:pPr>
-      <w:r>
-        <w:t>Chief: She didn't actually make it out of FTO. We have a three-month FTO process—a field training process—and we had some recurring issues, so we let her go.</w:t>
+        <w:t>Interviewer: Under this section I have marked and highlighted, it says that search warrants, search warrant affidavits, and arrest warrants are submitted to the chief of police or designee. You have a designee for these things, but this search warrant was also supposed to be submitted to you as well, according to our code, to my understanding.</w:t>
       </w:r>
     </w:p>
     <w:p>
@@ -1809,7 +1755,7 @@
         <w:t xml:space="preserve">Draft history and supporting context </w:t>
       </w:r>
       <w:r>
-        <w:t>V2 U33 and U34 preserve “so he just didn’t want to [unfinished explanation].” V3 omits it; the final later changes the remaining comma to a period.</w:t>
+        <w:t>The annotation was added between v2 and v3. The quoted policy sentence matches the supplied manual, but the subsection title does not. See manual PDF page 487.</w:t>
       </w:r>
     </w:p>
     <w:p>
@@ -1820,7 +1766,7 @@
         <w:t xml:space="preserve">Question or next step </w:t>
       </w:r>
       <w:r>
-        <w:t>Ask Daniel whether there was a meaningful unfinished explanation. If so, retain it with an unfinished thought marker. If it was merely an abandoned start, record the decision to omit it.</w:t>
+        <w:t>Correct the editorial annotation to the actual subsection title. Keep documentary context distinct from words attributed to a speaker.</w:t>
       </w:r>
     </w:p>
     <w:p>
@@ -1833,235 +1779,7 @@
         <w:pStyle w:val="Heading1"/>
       </w:pPr>
       <w:r>
-        <w:t>15 Unclear closing fragment omitted</w:t>
-      </w:r>
-    </w:p>
-    <w:p>
-      <w:r>
-        <w:rPr>
-          <w:b/>
-        </w:rPr>
-        <w:t xml:space="preserve">Location </w:t>
-      </w:r>
-      <w:r>
-        <w:t>Final PDF page 32</w:t>
-      </w:r>
-    </w:p>
-    <w:p>
-      <w:r>
-        <w:rPr>
-          <w:b/>
-        </w:rPr>
-        <w:t xml:space="preserve">Review status </w:t>
-      </w:r>
-      <w:r>
-        <w:t>Relevance and omission need confirmation</w:t>
-      </w:r>
-    </w:p>
-    <w:p>
-      <w:r>
-        <w:t>After the email discussion, the original contains “The only thing that’s semi edible is probably the present. This letter look at the house.” V2 retained an unclear closing fragment; the final deletes it entirely.</w:t>
-      </w:r>
-    </w:p>
-    <w:p>
-      <w:pPr>
-        <w:pStyle w:val="Heading2"/>
-      </w:pPr>
-      <w:r>
-        <w:t>Original app text with context   Lines 2091 to 2103</w:t>
-      </w:r>
-    </w:p>
-    <w:p>
-      <w:pPr>
-        <w:pStyle w:val="Sourceexcerpt"/>
-      </w:pPr>
-      <w:r>
-        <w:t>Okay, I'll send an email with you, and with the mayor. Just saying that we had this meeting, is that okay? Oh yeah, for sure. I, if you want whatever he does on his end, it's but yeah, absolutely. Um, Not totally fine. The only thing that's semi edible is probably the present. This letter look at the house. 6:37 PM</w:t>
-      </w:r>
-    </w:p>
-    <w:p>
-      <w:pPr>
-        <w:pStyle w:val="Heading2"/>
-      </w:pPr>
-      <w:r>
-        <w:t>Final transcript with context</w:t>
-      </w:r>
-    </w:p>
-    <w:p>
-      <w:pPr>
-        <w:pStyle w:val="Sourceexcerpt"/>
-      </w:pPr>
-      <w:r>
-        <w:t>Interviewer: I'll send an email with you and the mayor, just saying we had this meeting. Is that okay?</w:t>
-      </w:r>
-    </w:p>
-    <w:p>
-      <w:pPr>
-        <w:pStyle w:val="Sourceexcerpt"/>
-      </w:pPr>
-      <w:r>
-        <w:t>Chief: For sure. Whatever he does on his end, absolutely. That's totally fine.</w:t>
-      </w:r>
-    </w:p>
-    <w:p>
-      <w:pPr>
-        <w:pStyle w:val="Sourceexcerpt"/>
-      </w:pPr>
-      <w:r>
-        <w:t>6:37 PM</w:t>
-      </w:r>
-    </w:p>
-    <w:p>
-      <w:pPr>
-        <w:pStyle w:val="Sourceexcerpt"/>
-      </w:pPr>
-      <w:r>
-        <w:t>END OF SOURCE</w:t>
-      </w:r>
-    </w:p>
-    <w:p>
-      <w:r>
-        <w:rPr>
-          <w:b/>
-        </w:rPr>
-        <w:t xml:space="preserve">Draft history and supporting context </w:t>
-      </w:r>
-      <w:r>
-        <w:t>V2 U42 and U43 explicitly preserve the uncertainty. The 6:37 PM timestamp itself is in the original; this review does not establish that it is the interview end time.</w:t>
-      </w:r>
-    </w:p>
-    <w:p>
-      <w:r>
-        <w:rPr>
-          <w:b/>
-        </w:rPr>
-        <w:t xml:space="preserve">Question or next step </w:t>
-      </w:r>
-      <w:r>
-        <w:t>Ask Daniel whether this was unrelated background speech, an app error, or part of the meeting. Do not restore the nonsense literally as intelligible dialogue or silently assume it was irrelevant.</w:t>
-      </w:r>
-    </w:p>
-    <w:p>
-      <w:r>
-        <w:br w:type="page"/>
-      </w:r>
-    </w:p>
-    <w:p>
-      <w:pPr>
-        <w:pStyle w:val="Heading1"/>
-      </w:pPr>
-      <w:r>
-        <w:t>16 Incorrect label for policy section 608 4 2</w:t>
-      </w:r>
-    </w:p>
-    <w:p>
-      <w:r>
-        <w:rPr>
-          <w:b/>
-        </w:rPr>
-        <w:t xml:space="preserve">Location </w:t>
-      </w:r>
-      <w:r>
-        <w:t>Final PDF page 14</w:t>
-      </w:r>
-    </w:p>
-    <w:p>
-      <w:r>
-        <w:rPr>
-          <w:b/>
-        </w:rPr>
-        <w:t xml:space="preserve">Review status </w:t>
-      </w:r>
-      <w:r>
-        <w:t>Document annotation correction proposed</w:t>
-      </w:r>
-    </w:p>
-    <w:p>
-      <w:r>
-        <w:t>The final annotation calls section 608.4.2 Operations Planning and Deconfliction. In the supplied manual, that numbered subsection is titled Risk Assessment Review.</w:t>
-      </w:r>
-    </w:p>
-    <w:p>
-      <w:pPr>
-        <w:pStyle w:val="Heading2"/>
-      </w:pPr>
-      <w:r>
-        <w:t>Original app text with context   Lines 839 to 843</w:t>
-      </w:r>
-    </w:p>
-    <w:p>
-      <w:pPr>
-        <w:pStyle w:val="Sourceexcerpt"/>
-      </w:pPr>
-      <w:r>
-        <w:t>So, under this section that I have marked and highlighted, it says that search warrants app search warrants, affidavits, And a restaurant to the chief of police and designee, so that you in this it has that use that. You have a designated for these things, but this search warrant was also supposed to be submitted to you as well. Yes, according to our code to my understanding.</w:t>
-      </w:r>
-    </w:p>
-    <w:p>
-      <w:pPr>
-        <w:pStyle w:val="Heading2"/>
-      </w:pPr>
-      <w:r>
-        <w:t>Final transcript with context</w:t>
-      </w:r>
-    </w:p>
-    <w:p>
-      <w:pPr>
-        <w:pStyle w:val="Sourceexcerpt"/>
-      </w:pPr>
-      <w:r>
-        <w:t>Interviewer supplies a print out of policy 608.4.2 Operations Planning and Deconfliction with a highlighted portion stating:</w:t>
-      </w:r>
-    </w:p>
-    <w:p>
-      <w:pPr>
-        <w:pStyle w:val="Sourceexcerpt"/>
-      </w:pPr>
-      <w:r>
-        <w:t>“Officers will present the risk assessment form and other relevant documents, such as copies of search warrants, affidavits and arrest warrants, to the Chief of Police and designee.”</w:t>
-      </w:r>
-    </w:p>
-    <w:p>
-      <w:pPr>
-        <w:pStyle w:val="Sourceexcerpt"/>
-      </w:pPr>
-      <w:r>
-        <w:t>Interviewer: Under this section I have marked and highlighted, it says that search warrants, search warrant affidavits, and arrest warrants are submitted to the chief of police or designee. You have a designee for these things, but this search warrant was also supposed to be submitted to you as well, according to our code, to my understanding.</w:t>
-      </w:r>
-    </w:p>
-    <w:p>
-      <w:r>
-        <w:rPr>
-          <w:b/>
-        </w:rPr>
-        <w:t xml:space="preserve">Draft history and supporting context </w:t>
-      </w:r>
-      <w:r>
-        <w:t>The annotation was added between v2 and v3. The quoted policy sentence matches the supplied manual, but the subsection title does not. See manual PDF page 487.</w:t>
-      </w:r>
-    </w:p>
-    <w:p>
-      <w:r>
-        <w:rPr>
-          <w:b/>
-        </w:rPr>
-        <w:t xml:space="preserve">Question or next step </w:t>
-      </w:r>
-      <w:r>
-        <w:t>Correct the editorial annotation to the actual subsection title. Keep documentary context distinct from words attributed to a speaker.</w:t>
-      </w:r>
-    </w:p>
-    <w:p>
-      <w:r>
-        <w:br w:type="page"/>
-      </w:r>
-    </w:p>
-    <w:p>
-      <w:pPr>
-        <w:pStyle w:val="Heading1"/>
-      </w:pPr>
-      <w:r>
-        <w:t>17 Explanation of reconstruction inside the PDF</w:t>
+        <w:t>15 Explanation of reconstruction inside the PDF</w:t>
       </w:r>
     </w:p>
     <w:p>

</xml_diff>

<commit_message>
Correct Risk Assessment Review annotation and resolve review item
</commit_message>
<xml_diff>
--- a/findings/2026-10-26-chief-paul-transcript-review.docx
+++ b/findings/2026-10-26-chief-paul-transcript-review.docx
@@ -22,12 +22,12 @@
     </w:p>
     <w:p>
       <w:r>
-        <w:t>This document brings together 15 remaining review items, with surrounding original and final wording for discussion with Daniel Sroka. Some entries concern mechanical cleanup; others require confirmation of wording, speaker identity, or an intentional omission.</w:t>
+        <w:t>This document brings together 14 remaining review items, with surrounding original and final wording for discussion with Daniel Sroka. Some entries concern mechanical cleanup; others require confirmation of wording, speaker identity, or an intentional omission.</w:t>
       </w:r>
     </w:p>
     <w:p>
       <w:r>
-        <w:t>The page 10 leftover comparison block has already been removed from the final PDF on staging. Item 01 compares the original app wording directly with the current final. The approved Jaykob Thacker and Carlos Mootz De Arbeloa name corrections have been made and their former review entries removed. Remaining entries are questions, not established transcription errors or approved replacements.</w:t>
+        <w:t>The page 10 leftover comparison block has already been removed from the final PDF on staging. Item 01 compares the original app wording directly with the current final. The approved Jaykob Thacker and Carlos Mootz De Arbeloa name corrections and the Risk Assessment Review annotation correction have been made and their former review entries removed. Remaining entries are questions, not established transcription errors or approved replacements.</w:t>
       </w:r>
     </w:p>
     <w:p>
@@ -40,7 +40,7 @@
     </w:p>
     <w:p>
       <w:r>
-        <w:t>Original excerpts reproduce the app export without correcting its words. App line breaks have been normalized for readability; final paragraph breaks are retained where available. Punctuation and wording are retained. Original source line numbers refer to the unchanged TXT export. Final page numbers refer to PDF pages, counting the foreword as page 1. Final excerpts reflect the current final after the October 26 cleanup and approved name corrections.</w:t>
+        <w:t>Original excerpts reproduce the app export without correcting its words. App line breaks have been normalized for readability; final paragraph breaks are retained where available. Punctuation and wording are retained. Original source line numbers refer to the unchanged TXT export. Final page numbers refer to PDF pages, counting the foreword as page 1. Final excerpts reflect the current final after the October 26 cleanup and approved name and annotation corrections.</w:t>
       </w:r>
     </w:p>
     <w:p>
@@ -207,18 +207,7 @@
         <w:rPr>
           <w:sz w:val="20"/>
         </w:rPr>
-        <w:t>14  Incorrect label for policy section 608 4 2   |   PDF 14</w:t>
-      </w:r>
-    </w:p>
-    <w:p>
-      <w:pPr>
-        <w:spacing w:after="60"/>
-      </w:pPr>
-      <w:r>
-        <w:rPr>
-          <w:sz w:val="20"/>
-        </w:rPr>
-        <w:t>15  Explanation of reconstruction inside the PDF   |   PDF 1</w:t>
+        <w:t>14  Explanation of reconstruction inside the PDF   |   PDF 1</w:t>
       </w:r>
     </w:p>
     <w:p>
@@ -824,7 +813,7 @@
         <w:pStyle w:val="Sourceexcerpt"/>
       </w:pPr>
       <w:r>
-        <w:t>Interviewer supplies a print out of policy 608.4.2 Operations Planning and Deconfliction with a highlighted portion stating:</w:t>
+        <w:t>Interviewer supplies a print out of policy 608.4.2 Risk Assessment Review with a highlighted portion stating:</w:t>
       </w:r>
     </w:p>
     <w:p>
@@ -1669,117 +1658,7 @@
         <w:pStyle w:val="Heading1"/>
       </w:pPr>
       <w:r>
-        <w:t>14 Incorrect label for policy section 608 4 2</w:t>
-      </w:r>
-    </w:p>
-    <w:p>
-      <w:r>
-        <w:rPr>
-          <w:b/>
-        </w:rPr>
-        <w:t xml:space="preserve">Location </w:t>
-      </w:r>
-      <w:r>
-        <w:t>Final PDF page 14</w:t>
-      </w:r>
-    </w:p>
-    <w:p>
-      <w:r>
-        <w:rPr>
-          <w:b/>
-        </w:rPr>
-        <w:t xml:space="preserve">Review status </w:t>
-      </w:r>
-      <w:r>
-        <w:t>Document annotation correction proposed</w:t>
-      </w:r>
-    </w:p>
-    <w:p>
-      <w:r>
-        <w:t>The final annotation calls section 608.4.2 Operations Planning and Deconfliction. In the supplied manual, that numbered subsection is titled Risk Assessment Review.</w:t>
-      </w:r>
-    </w:p>
-    <w:p>
-      <w:pPr>
-        <w:pStyle w:val="Heading2"/>
-      </w:pPr>
-      <w:r>
-        <w:t>Original app text with context   Lines 839 to 843</w:t>
-      </w:r>
-    </w:p>
-    <w:p>
-      <w:pPr>
-        <w:pStyle w:val="Sourceexcerpt"/>
-      </w:pPr>
-      <w:r>
-        <w:t>So, under this section that I have marked and highlighted, it says that search warrants app search warrants, affidavits, And a restaurant to the chief of police and designee, so that you in this it has that use that. You have a designated for these things, but this search warrant was also supposed to be submitted to you as well. Yes, according to our code to my understanding.</w:t>
-      </w:r>
-    </w:p>
-    <w:p>
-      <w:pPr>
-        <w:pStyle w:val="Heading2"/>
-      </w:pPr>
-      <w:r>
-        <w:t>Final transcript with context</w:t>
-      </w:r>
-    </w:p>
-    <w:p>
-      <w:pPr>
-        <w:pStyle w:val="Sourceexcerpt"/>
-      </w:pPr>
-      <w:r>
-        <w:t>Interviewer supplies a print out of policy 608.4.2 Operations Planning and Deconfliction with a highlighted portion stating:</w:t>
-      </w:r>
-    </w:p>
-    <w:p>
-      <w:pPr>
-        <w:pStyle w:val="Sourceexcerpt"/>
-      </w:pPr>
-      <w:r>
-        <w:t>“Officers will present the risk assessment form and other relevant documents, such as copies of search warrants, affidavits and arrest warrants, to the Chief of Police and designee.”</w:t>
-      </w:r>
-    </w:p>
-    <w:p>
-      <w:pPr>
-        <w:pStyle w:val="Sourceexcerpt"/>
-      </w:pPr>
-      <w:r>
-        <w:t>Interviewer: Under this section I have marked and highlighted, it says that search warrants, search warrant affidavits, and arrest warrants are submitted to the chief of police or designee. You have a designee for these things, but this search warrant was also supposed to be submitted to you as well, according to our code, to my understanding.</w:t>
-      </w:r>
-    </w:p>
-    <w:p>
-      <w:r>
-        <w:rPr>
-          <w:b/>
-        </w:rPr>
-        <w:t xml:space="preserve">Draft history and supporting context </w:t>
-      </w:r>
-      <w:r>
-        <w:t>The annotation was added between v2 and v3. The quoted policy sentence matches the supplied manual, but the subsection title does not. See manual PDF page 487.</w:t>
-      </w:r>
-    </w:p>
-    <w:p>
-      <w:r>
-        <w:rPr>
-          <w:b/>
-        </w:rPr>
-        <w:t xml:space="preserve">Question or next step </w:t>
-      </w:r>
-      <w:r>
-        <w:t>Correct the editorial annotation to the actual subsection title. Keep documentary context distinct from words attributed to a speaker.</w:t>
-      </w:r>
-    </w:p>
-    <w:p>
-      <w:r>
-        <w:br w:type="page"/>
-      </w:r>
-    </w:p>
-    <w:p>
-      <w:pPr>
-        <w:pStyle w:val="Heading1"/>
-      </w:pPr>
-      <w:r>
-        <w:t>15 Explanation of reconstruction inside the PDF</w:t>
+        <w:t>14 Explanation of reconstruction inside the PDF</w:t>
       </w:r>
     </w:p>
     <w:p>

</xml_diff>

<commit_message>
Restore and designee wording and resolve transcript review item
</commit_message>
<xml_diff>
--- a/findings/2026-10-26-chief-paul-transcript-review.docx
+++ b/findings/2026-10-26-chief-paul-transcript-review.docx
@@ -22,12 +22,12 @@
     </w:p>
     <w:p>
       <w:r>
-        <w:t>This document brings together 14 remaining review items, with surrounding original and final wording for discussion with Daniel Sroka. Some entries concern mechanical cleanup; others require confirmation of wording, speaker identity, or an intentional omission.</w:t>
+        <w:t>This document brings together 13 remaining review items, with surrounding original and final wording for discussion with Daniel Sroka. Some entries concern mechanical cleanup; others require confirmation of wording, speaker identity, or an intentional omission.</w:t>
       </w:r>
     </w:p>
     <w:p>
       <w:r>
-        <w:t>The page 10 leftover comparison block has already been removed from the final PDF on staging. Item 01 compares the original app wording directly with the current final. The approved Jaykob Thacker and Carlos Mootz De Arbeloa name corrections and the Risk Assessment Review annotation correction have been made and their former review entries removed. Remaining entries are questions, not established transcription errors or approved replacements.</w:t>
+        <w:t>The page 10 leftover comparison block has already been removed from the final PDF on staging. Item 01 compares the original app wording directly with the current final. Four resolved entries have been removed: the Jaykob Thacker spelling, the Carlos Mootz De Arbeloa name, the Risk Assessment Review annotation title, and the chief of police and designee conjunction. Remaining entries are questions, not established transcription errors or approved replacements.</w:t>
       </w:r>
     </w:p>
     <w:p>
@@ -119,7 +119,7 @@
         <w:rPr>
           <w:sz w:val="20"/>
         </w:rPr>
-        <w:t>06  And versus or in the policy discussion   |   PDF 14</w:t>
+        <w:t>06  Inconsistent name for the force report   |   PDF 16 and 17</w:t>
       </w:r>
     </w:p>
     <w:p>
@@ -130,7 +130,7 @@
         <w:rPr>
           <w:sz w:val="20"/>
         </w:rPr>
-        <w:t>07  Inconsistent name for the force report   |   PDF 16 and 17</w:t>
+        <w:t>07  Removed negative in the victim discussion   |   PDF 21 and 22</w:t>
       </w:r>
     </w:p>
     <w:p>
@@ -141,7 +141,7 @@
         <w:rPr>
           <w:sz w:val="20"/>
         </w:rPr>
-        <w:t>08  Removed negative in the victim discussion   |   PDF 21 and 22</w:t>
+        <w:t>08  Speaker assigned to I do   |   PDF 21</w:t>
       </w:r>
     </w:p>
     <w:p>
@@ -152,7 +152,7 @@
         <w:rPr>
           <w:sz w:val="20"/>
         </w:rPr>
-        <w:t>09  Speaker assigned to I do   |   PDF 21</w:t>
+        <w:t>09  High changed to higher   |   PDF 22</w:t>
       </w:r>
     </w:p>
     <w:p>
@@ -163,7 +163,7 @@
         <w:rPr>
           <w:sz w:val="20"/>
         </w:rPr>
-        <w:t>10  High changed to higher   |   PDF 22</w:t>
+        <w:t>10  Possible joined speakers around that horrible   |   PDF 31</w:t>
       </w:r>
     </w:p>
     <w:p>
@@ -174,7 +174,7 @@
         <w:rPr>
           <w:sz w:val="20"/>
         </w:rPr>
-        <w:t>11  Possible joined speakers around that horrible   |   PDF 31</w:t>
+        <w:t>11  Unfinished Lunt explanation omitted   |   PDF 28</w:t>
       </w:r>
     </w:p>
     <w:p>
@@ -185,7 +185,7 @@
         <w:rPr>
           <w:sz w:val="20"/>
         </w:rPr>
-        <w:t>12  Unfinished Lunt explanation omitted   |   PDF 28</w:t>
+        <w:t>12  Unclear closing fragment omitted   |   PDF 32</w:t>
       </w:r>
     </w:p>
     <w:p>
@@ -196,18 +196,7 @@
         <w:rPr>
           <w:sz w:val="20"/>
         </w:rPr>
-        <w:t>13  Unclear closing fragment omitted   |   PDF 32</w:t>
-      </w:r>
-    </w:p>
-    <w:p>
-      <w:pPr>
-        <w:spacing w:after="60"/>
-      </w:pPr>
-      <w:r>
-        <w:rPr>
-          <w:sz w:val="20"/>
-        </w:rPr>
-        <w:t>14  Explanation of reconstruction inside the PDF   |   PDF 1</w:t>
+        <w:t>13  Explanation of reconstruction inside the PDF   |   PDF 1</w:t>
       </w:r>
     </w:p>
     <w:p>
@@ -754,125 +743,7 @@
         <w:pStyle w:val="Heading1"/>
       </w:pPr>
       <w:r>
-        <w:t>06 And versus or in the policy discussion</w:t>
-      </w:r>
-    </w:p>
-    <w:p>
-      <w:r>
-        <w:rPr>
-          <w:b/>
-        </w:rPr>
-        <w:t xml:space="preserve">Location </w:t>
-      </w:r>
-      <w:r>
-        <w:t>Final PDF page 14</w:t>
-      </w:r>
-    </w:p>
-    <w:p>
-      <w:r>
-        <w:rPr>
-          <w:b/>
-        </w:rPr>
-        <w:t xml:space="preserve">Review status </w:t>
-      </w:r>
-      <w:r>
-        <w:t>Meaning sensitive wording needs confirmation</w:t>
-      </w:r>
-    </w:p>
-    <w:p>
-      <w:r>
-        <w:t>Both the original app wording and the inserted policy quotation use “and designee.” The final speech attributed to the interviewer uses “or designee.” The conjunction affects what the sentence says about review.</w:t>
-      </w:r>
-    </w:p>
-    <w:p>
-      <w:pPr>
-        <w:pStyle w:val="Heading2"/>
-      </w:pPr>
-      <w:r>
-        <w:t>Original app text with context   Lines 839 to 847</w:t>
-      </w:r>
-    </w:p>
-    <w:p>
-      <w:pPr>
-        <w:pStyle w:val="Sourceexcerpt"/>
-      </w:pPr>
-      <w:r>
-        <w:t>So, under this section that I have marked and highlighted, it says that search warrants app search warrants, affidavits, And a restaurant to the chief of police and designee, so that you in this it has that use that. You have a designated for these things, but this search warrant was also supposed to be submitted to you as well. Yes, according to our code to my understanding. So this, I wouldn't qualify this to be something similar to a major SWAT operation where we're doing deconfliction. We're doing risk assessments and whatnot.</w:t>
-      </w:r>
-    </w:p>
-    <w:p>
-      <w:pPr>
-        <w:pStyle w:val="Heading2"/>
-      </w:pPr>
-      <w:r>
-        <w:t>Final transcript with context</w:t>
-      </w:r>
-    </w:p>
-    <w:p>
-      <w:pPr>
-        <w:pStyle w:val="Sourceexcerpt"/>
-      </w:pPr>
-      <w:r>
-        <w:t>Interviewer supplies a print out of policy 608.4.2 Risk Assessment Review with a highlighted portion stating:</w:t>
-      </w:r>
-    </w:p>
-    <w:p>
-      <w:pPr>
-        <w:pStyle w:val="Sourceexcerpt"/>
-      </w:pPr>
-      <w:r>
-        <w:t>“Officers will present the risk assessment form and other relevant documents, such as copies of search warrants, affidavits and arrest warrants, to the Chief of Police and designee.”</w:t>
-      </w:r>
-    </w:p>
-    <w:p>
-      <w:pPr>
-        <w:pStyle w:val="Sourceexcerpt"/>
-      </w:pPr>
-      <w:r>
-        <w:t>Interviewer: Under this section I have marked and highlighted, it says that search warrants, search warrant affidavits, and arrest warrants are submitted to the chief of police or designee. You have a designee for these things, but this search warrant was also supposed to be submitted to you as well, according to our code, to my understanding.</w:t>
-      </w:r>
-    </w:p>
-    <w:p>
-      <w:pPr>
-        <w:pStyle w:val="Sourceexcerpt"/>
-      </w:pPr>
-      <w:r>
-        <w:t>Chief: I wouldn't qualify this as something similar to a major SWAT operation where we're doing deconfliction, risk assessments, and whatnot.</w:t>
-      </w:r>
-    </w:p>
-    <w:p>
-      <w:r>
-        <w:rPr>
-          <w:b/>
-        </w:rPr>
-        <w:t xml:space="preserve">Draft history and supporting context </w:t>
-      </w:r>
-      <w:r>
-        <w:t>The supplied policy manual confirms “Chief of Police and designee” in section 608.4.2. The source also contains a short “Yes” near “submitted to you as well”; its speaker is not established by the app text.</w:t>
-      </w:r>
-    </w:p>
-    <w:p>
-      <w:r>
-        <w:rPr>
-          <w:b/>
-        </w:rPr>
-        <w:t xml:space="preserve">Question or next step </w:t>
-      </w:r>
-      <w:r>
-        <w:t>Confirm the spoken conjunction with Daniel. Preserve any genuine spoken paraphrase as speech, while keeping the documentary quotation exact and clearly identified.</w:t>
-      </w:r>
-    </w:p>
-    <w:p>
-      <w:r>
-        <w:br w:type="page"/>
-      </w:r>
-    </w:p>
-    <w:p>
-      <w:pPr>
-        <w:pStyle w:val="Heading1"/>
-      </w:pPr>
-      <w:r>
-        <w:t>07 Inconsistent name for the force report</w:t>
+        <w:t>06 Inconsistent name for the force report</w:t>
       </w:r>
     </w:p>
     <w:p>
@@ -998,7 +869,7 @@
         <w:pStyle w:val="Heading1"/>
       </w:pPr>
       <w:r>
-        <w:t>08 Removed negative in the victim discussion</w:t>
+        <w:t>07 Removed negative in the victim discussion</w:t>
       </w:r>
     </w:p>
     <w:p>
@@ -1108,7 +979,7 @@
         <w:pStyle w:val="Heading1"/>
       </w:pPr>
       <w:r>
-        <w:t>09 Speaker assigned to I do</w:t>
+        <w:t>08 Speaker assigned to I do</w:t>
       </w:r>
     </w:p>
     <w:p>
@@ -1218,7 +1089,7 @@
         <w:pStyle w:val="Heading1"/>
       </w:pPr>
       <w:r>
-        <w:t>10 High changed to higher</w:t>
+        <w:t>09 High changed to higher</w:t>
       </w:r>
     </w:p>
     <w:p>
@@ -1312,7 +1183,7 @@
         <w:pStyle w:val="Heading1"/>
       </w:pPr>
       <w:r>
-        <w:t>11 Possible joined speakers around that horrible</w:t>
+        <w:t>10 Possible joined speakers around that horrible</w:t>
       </w:r>
     </w:p>
     <w:p>
@@ -1422,7 +1293,7 @@
         <w:pStyle w:val="Heading1"/>
       </w:pPr>
       <w:r>
-        <w:t>12 Unfinished Lunt explanation omitted</w:t>
+        <w:t>11 Unfinished Lunt explanation omitted</w:t>
       </w:r>
     </w:p>
     <w:p>
@@ -1540,7 +1411,7 @@
         <w:pStyle w:val="Heading1"/>
       </w:pPr>
       <w:r>
-        <w:t>13 Unclear closing fragment omitted</w:t>
+        <w:t>12 Unclear closing fragment omitted</w:t>
       </w:r>
     </w:p>
     <w:p>
@@ -1658,7 +1529,7 @@
         <w:pStyle w:val="Heading1"/>
       </w:pPr>
       <w:r>
-        <w:t>14 Explanation of reconstruction inside the PDF</w:t>
+        <w:t>13 Explanation of reconstruction inside the PDF</w:t>
       </w:r>
     </w:p>
     <w:p>

</xml_diff>

<commit_message>
Restore sentence break and resolve transcript review item
</commit_message>
<xml_diff>
--- a/findings/2026-10-26-chief-paul-transcript-review.docx
+++ b/findings/2026-10-26-chief-paul-transcript-review.docx
@@ -22,12 +22,12 @@
     </w:p>
     <w:p>
       <w:r>
-        <w:t>This document brings together 13 remaining review items, with surrounding original and final wording for discussion with Daniel Sroka. Some entries concern mechanical cleanup; others require confirmation of wording, speaker identity, or an intentional omission.</w:t>
+        <w:t>This document brings together 12 remaining review items, with surrounding original and final wording for discussion with Daniel Sroka. Some entries concern mechanical cleanup; others require confirmation of wording, speaker identity, or an intentional omission.</w:t>
       </w:r>
     </w:p>
     <w:p>
       <w:r>
-        <w:t>The page 10 leftover comparison block has already been removed from the final PDF on staging. Item 01 compares the original app wording directly with the current final. Four resolved entries have been removed: the Jaykob Thacker spelling, the Carlos Mootz De Arbeloa name, the Risk Assessment Review annotation title, and the chief of police and designee conjunction. Remaining entries are questions, not established transcription errors or approved replacements.</w:t>
+        <w:t>The page 10 leftover comparison block has already been removed from the final PDF on staging. Item 01 compares the original app wording directly with the current final. Five resolved entries have been removed: the Jaykob Thacker spelling, the Carlos Mootz De Arbeloa name, the Risk Assessment Review annotation title, the chief of police and designee conjunction, and the missing period after explanation. Remaining entries are questions, not established transcription errors or approved replacements.</w:t>
       </w:r>
     </w:p>
     <w:p>
@@ -75,7 +75,7 @@
         <w:rPr>
           <w:sz w:val="20"/>
         </w:rPr>
-        <w:t>02  Missing sentence break after explanation   |   PDF 10</w:t>
+        <w:t>02  Unclosed aside about Quinn   |   PDF 17</w:t>
       </w:r>
     </w:p>
     <w:p>
@@ -86,7 +86,7 @@
         <w:rPr>
           <w:sz w:val="20"/>
         </w:rPr>
-        <w:t>03  Unclosed aside about Quinn   |   PDF 17</w:t>
+        <w:t>03  Broken request to seek dismissal   |   PDF 25</w:t>
       </w:r>
     </w:p>
     <w:p>
@@ -97,7 +97,7 @@
         <w:rPr>
           <w:sz w:val="20"/>
         </w:rPr>
-        <w:t>04  Broken request to seek dismissal   |   PDF 25</w:t>
+        <w:t>04  Stranded lifelong in the Christensen discussion   |   PDF 28</w:t>
       </w:r>
     </w:p>
     <w:p>
@@ -108,7 +108,7 @@
         <w:rPr>
           <w:sz w:val="20"/>
         </w:rPr>
-        <w:t>05  Stranded lifelong in the Christensen discussion   |   PDF 28</w:t>
+        <w:t>05  Inconsistent name for the force report   |   PDF 16 and 17</w:t>
       </w:r>
     </w:p>
     <w:p>
@@ -119,7 +119,7 @@
         <w:rPr>
           <w:sz w:val="20"/>
         </w:rPr>
-        <w:t>06  Inconsistent name for the force report   |   PDF 16 and 17</w:t>
+        <w:t>06  Removed negative in the victim discussion   |   PDF 21 and 22</w:t>
       </w:r>
     </w:p>
     <w:p>
@@ -130,7 +130,7 @@
         <w:rPr>
           <w:sz w:val="20"/>
         </w:rPr>
-        <w:t>07  Removed negative in the victim discussion   |   PDF 21 and 22</w:t>
+        <w:t>07  Speaker assigned to I do   |   PDF 21</w:t>
       </w:r>
     </w:p>
     <w:p>
@@ -141,7 +141,7 @@
         <w:rPr>
           <w:sz w:val="20"/>
         </w:rPr>
-        <w:t>08  Speaker assigned to I do   |   PDF 21</w:t>
+        <w:t>08  High changed to higher   |   PDF 22</w:t>
       </w:r>
     </w:p>
     <w:p>
@@ -152,7 +152,7 @@
         <w:rPr>
           <w:sz w:val="20"/>
         </w:rPr>
-        <w:t>09  High changed to higher   |   PDF 22</w:t>
+        <w:t>09  Possible joined speakers around that horrible   |   PDF 31</w:t>
       </w:r>
     </w:p>
     <w:p>
@@ -163,7 +163,7 @@
         <w:rPr>
           <w:sz w:val="20"/>
         </w:rPr>
-        <w:t>10  Possible joined speakers around that horrible   |   PDF 31</w:t>
+        <w:t>10  Unfinished Lunt explanation omitted   |   PDF 28</w:t>
       </w:r>
     </w:p>
     <w:p>
@@ -174,7 +174,7 @@
         <w:rPr>
           <w:sz w:val="20"/>
         </w:rPr>
-        <w:t>11  Unfinished Lunt explanation omitted   |   PDF 28</w:t>
+        <w:t>11  Unclear closing fragment omitted   |   PDF 32</w:t>
       </w:r>
     </w:p>
     <w:p>
@@ -185,18 +185,7 @@
         <w:rPr>
           <w:sz w:val="20"/>
         </w:rPr>
-        <w:t>12  Unclear closing fragment omitted   |   PDF 32</w:t>
-      </w:r>
-    </w:p>
-    <w:p>
-      <w:pPr>
-        <w:spacing w:after="60"/>
-      </w:pPr>
-      <w:r>
-        <w:rPr>
-          <w:sz w:val="20"/>
-        </w:rPr>
-        <w:t>13  Explanation of reconstruction inside the PDF   |   PDF 1</w:t>
+        <w:t>12  Explanation of reconstruction inside the PDF   |   PDF 1</w:t>
       </w:r>
     </w:p>
     <w:p>
@@ -284,7 +273,7 @@
         <w:pStyle w:val="Sourceexcerpt"/>
       </w:pPr>
       <w:r>
-        <w:t>I've heard Lieutenant Adamson's explanation It differs from what's in his report, but what's written in his report would not be a justification for seizing the phone. I completely can see how that's an issue.</w:t>
+        <w:t>I've heard Lieutenant Adamson's explanation. It differs from what's in his report, but what's written in his report would not be a justification for seizing the phone. I completely can see how that's an issue.</w:t>
       </w:r>
     </w:p>
     <w:p>
@@ -319,101 +308,7 @@
         <w:pStyle w:val="Heading1"/>
       </w:pPr>
       <w:r>
-        <w:t>02 Missing sentence break after explanation</w:t>
-      </w:r>
-    </w:p>
-    <w:p>
-      <w:r>
-        <w:rPr>
-          <w:b/>
-        </w:rPr>
-        <w:t xml:space="preserve">Location </w:t>
-      </w:r>
-      <w:r>
-        <w:t>Final PDF page 10</w:t>
-      </w:r>
-    </w:p>
-    <w:p>
-      <w:r>
-        <w:rPr>
-          <w:b/>
-        </w:rPr>
-        <w:t xml:space="preserve">Review status </w:t>
-      </w:r>
-      <w:r>
-        <w:t>Mechanical correction proposed</w:t>
-      </w:r>
-    </w:p>
-    <w:p>
-      <w:r>
-        <w:t>The final joins “explanation” directly to “It differs” without punctuation. A bracketed name note was removed from between those words.</w:t>
-      </w:r>
-    </w:p>
-    <w:p>
-      <w:pPr>
-        <w:pStyle w:val="Heading2"/>
-      </w:pPr>
-      <w:r>
-        <w:t>Original app text with context   Lines 600 to 604</w:t>
-      </w:r>
-    </w:p>
-    <w:p>
-      <w:pPr>
-        <w:pStyle w:val="Sourceexcerpt"/>
-      </w:pPr>
-      <w:r>
-        <w:t>So, Um, If Is, I've heard Is, I've heard Lieutenant Adams it's explanation. It differs from what's in misery report, but what's written in his report Would not be a justification for seizing the phone. I completely can conceive how that that's an issue,</w:t>
-      </w:r>
-    </w:p>
-    <w:p>
-      <w:pPr>
-        <w:pStyle w:val="Heading2"/>
-      </w:pPr>
-      <w:r>
-        <w:t>Final transcript with context</w:t>
-      </w:r>
-    </w:p>
-    <w:p>
-      <w:pPr>
-        <w:pStyle w:val="Sourceexcerpt"/>
-      </w:pPr>
-      <w:r>
-        <w:t>I've heard Lieutenant Adamson's explanation It differs from what's in his report, but what's written in his report would not be a justification for seizing the phone. I completely can see how that's an issue.</w:t>
-      </w:r>
-    </w:p>
-    <w:p>
-      <w:r>
-        <w:rPr>
-          <w:b/>
-        </w:rPr>
-        <w:t xml:space="preserve">Draft history and supporting context </w:t>
-      </w:r>
-      <w:r>
-        <w:t>V2 reads “explanation [the source also renders the name as ‘Lieutenant Adams’]. It differs…” with a sentence break. That break was lost in the later PDF.</w:t>
-      </w:r>
-    </w:p>
-    <w:p>
-      <w:r>
-        <w:rPr>
-          <w:b/>
-        </w:rPr>
-        <w:t xml:space="preserve">Question or next step </w:t>
-      </w:r>
-      <w:r>
-        <w:t>Insert a period after “explanation.” This does not require interpreting the speaker’s meaning.</w:t>
-      </w:r>
-    </w:p>
-    <w:p>
-      <w:r>
-        <w:br w:type="page"/>
-      </w:r>
-    </w:p>
-    <w:p>
-      <w:pPr>
-        <w:pStyle w:val="Heading1"/>
-      </w:pPr>
-      <w:r>
-        <w:t>03 Unclosed aside about Quinn</w:t>
+        <w:t>02 Unclosed aside about Quinn</w:t>
       </w:r>
     </w:p>
     <w:p>
@@ -515,7 +410,7 @@
         <w:pStyle w:val="Heading1"/>
       </w:pPr>
       <w:r>
-        <w:t>04 Broken request to seek dismissal</w:t>
+        <w:t>03 Broken request to seek dismissal</w:t>
       </w:r>
     </w:p>
     <w:p>
@@ -625,7 +520,7 @@
         <w:pStyle w:val="Heading1"/>
       </w:pPr>
       <w:r>
-        <w:t>05 Stranded lifelong in the Christensen discussion</w:t>
+        <w:t>04 Stranded lifelong in the Christensen discussion</w:t>
       </w:r>
     </w:p>
     <w:p>
@@ -743,7 +638,7 @@
         <w:pStyle w:val="Heading1"/>
       </w:pPr>
       <w:r>
-        <w:t>06 Inconsistent name for the force report</w:t>
+        <w:t>05 Inconsistent name for the force report</w:t>
       </w:r>
     </w:p>
     <w:p>
@@ -869,7 +764,7 @@
         <w:pStyle w:val="Heading1"/>
       </w:pPr>
       <w:r>
-        <w:t>07 Removed negative in the victim discussion</w:t>
+        <w:t>06 Removed negative in the victim discussion</w:t>
       </w:r>
     </w:p>
     <w:p>
@@ -979,7 +874,7 @@
         <w:pStyle w:val="Heading1"/>
       </w:pPr>
       <w:r>
-        <w:t>08 Speaker assigned to I do</w:t>
+        <w:t>07 Speaker assigned to I do</w:t>
       </w:r>
     </w:p>
     <w:p>
@@ -1089,7 +984,7 @@
         <w:pStyle w:val="Heading1"/>
       </w:pPr>
       <w:r>
-        <w:t>09 High changed to higher</w:t>
+        <w:t>08 High changed to higher</w:t>
       </w:r>
     </w:p>
     <w:p>
@@ -1183,7 +1078,7 @@
         <w:pStyle w:val="Heading1"/>
       </w:pPr>
       <w:r>
-        <w:t>10 Possible joined speakers around that horrible</w:t>
+        <w:t>09 Possible joined speakers around that horrible</w:t>
       </w:r>
     </w:p>
     <w:p>
@@ -1293,7 +1188,7 @@
         <w:pStyle w:val="Heading1"/>
       </w:pPr>
       <w:r>
-        <w:t>11 Unfinished Lunt explanation omitted</w:t>
+        <w:t>10 Unfinished Lunt explanation omitted</w:t>
       </w:r>
     </w:p>
     <w:p>
@@ -1411,7 +1306,7 @@
         <w:pStyle w:val="Heading1"/>
       </w:pPr>
       <w:r>
-        <w:t>12 Unclear closing fragment omitted</w:t>
+        <w:t>11 Unclear closing fragment omitted</w:t>
       </w:r>
     </w:p>
     <w:p>
@@ -1529,7 +1424,7 @@
         <w:pStyle w:val="Heading1"/>
       </w:pPr>
       <w:r>
-        <w:t>13 Explanation of reconstruction inside the PDF</w:t>
+        <w:t>12 Explanation of reconstruction inside the PDF</w:t>
       </w:r>
     </w:p>
     <w:p>

</xml_diff>